<commit_message>
"Added files for Terraform"
</commit_message>
<xml_diff>
--- a/deployment_v2/Reflection.docx
+++ b/deployment_v2/Reflection.docx
@@ -148,7 +148,55 @@
         <w:t>. The state file allows users to accurately track the live infrastructure's current state for easy planning of subsequent changes, and the dependency graph ensures that all cloud resources are initialized in the correct order during deployment.</w:t>
       </w:r>
     </w:p>
-    <w:p/>
+    <w:p>
+      <w:r>
+        <w:t xml:space="preserve">What works well is terraform correctly deploying resources in the required order which prevents any resources from being deployed without the necessary pre-requisites. But one thing that does not work as intended due to GCP latency not terraform is that though resources can be successfully deployed GCP may not register a successful deployment by the time the dependency resource terraform is now deploying is being deployed which can lead to IAM </w:t>
+      </w:r>
+      <w:proofErr w:type="spellStart"/>
+      <w:r>
+        <w:t>permissioning</w:t>
+      </w:r>
+      <w:proofErr w:type="spellEnd"/>
+      <w:r>
+        <w:t xml:space="preserve"> issues or non-connected resources due to variables not being sent/received by the time the next resource is deployed. </w:t>
+      </w:r>
+      <w:r>
+        <w:br/>
+        <w:t>Some other things that worked well is being able to define multiple terraform (.</w:t>
+      </w:r>
+      <w:proofErr w:type="spellStart"/>
+      <w:r>
+        <w:t>tf</w:t>
+      </w:r>
+      <w:proofErr w:type="spellEnd"/>
+      <w:r>
+        <w:t xml:space="preserve">) files for different resource groups, </w:t>
+      </w:r>
+      <w:proofErr w:type="spellStart"/>
+      <w:r>
+        <w:t>yfinance,nws,common</w:t>
+      </w:r>
+      <w:proofErr w:type="spellEnd"/>
+      <w:r>
+        <w:t xml:space="preserve"> </w:t>
+      </w:r>
+      <w:proofErr w:type="spellStart"/>
+      <w:r>
+        <w:t>etc</w:t>
+      </w:r>
+      <w:proofErr w:type="spellEnd"/>
+      <w:r>
+        <w:t xml:space="preserve"> where similar to python files define different resource deployments but when terraform apply is run will deploy all .</w:t>
+      </w:r>
+      <w:proofErr w:type="spellStart"/>
+      <w:r>
+        <w:t>tf</w:t>
+      </w:r>
+      <w:proofErr w:type="spellEnd"/>
+      <w:r>
+        <w:t xml:space="preserve"> files in the correct order. </w:t>
+      </w:r>
+    </w:p>
     <w:sectPr>
       <w:pgSz w:w="12240" w:h="15840"/>
       <w:pgMar w:top="1440" w:right="1440" w:bottom="1440" w:left="1440" w:header="720" w:footer="720" w:gutter="0"/>

</xml_diff>